<commit_message>
docs: update Workers migration status
</commit_message>
<xml_diff>
--- a/docs/Guia de Cloudflare Workers para Pidemelo.docx
+++ b/docs/Guia de Cloudflare Workers para Pidemelo.docx
@@ -1514,14 +1514,17 @@
           <w:rFonts w:ascii="Arial" w:hAnsi="Arial"/>
         </w:rPr>
       </w:r>
+      <w:r/>
+      <w:r/>
       <w:r>
-        <w:t>El código de OpenNext y Wrangler ya estaba en `master` antes de iniciar esta migración. El fallo observado en Pages se debió a que ese proyecto todavía ejecutaba `npx @cloudflare/next-on-pages@1`. En esta tarea se están alineando localmente el README y los comandos con Workers Builds; los cambios aún deben publicarse en GitHub. La compilación local en Windows no completó: el entorno tenía Node 26 y Next.js no encontró un archivo interno de `jest-worker`; el propio proyecto indica usar Linux/macOS para el build de OpenNext. La comprobación definitiva debe ejecutarse en Workers Builds o en la validación Linux de GitHub Actions.</w:t>
+        <w:t>El código de OpenNext y Wrangler ya estaba en `master` antes de iniciar esta migración. El fallo de Pages se debió a que ese proyecto todavía ejecutaba `npx @cloudflare/next-on-pages@1`. Los cambios del README y los comandos se publicaron en GitHub en el commit e35cc97. GitHub Actions no llegó a ejecutar la validación: GitHub indica que la cuenta está bloqueada por un problema de facturación. La compilación local en Windows tampoco completó con Node 26; el proyecto recomienda Linux o macOS para compilar OpenNext. La comprobación del código sigue pendiente en Workers Builds o en GitHub Actions.</w:t>
       </w:r>
     </w:p>
     <w:p>
       <w:r/>
+      <w:r/>
       <w:r>
-        <w:t>El Worker `pidemelo-app` ya está creado en workers.dev y conectado a `gontzi/pidemelo`, rama `master`; las compilaciones siguen pausadas hasta publicar el código actualizado y completar las variables públicas de build. Ahora mismo su URL workers.dev muestra el Worker de bienvenida. Pages continúa sirviendo `pidemelo.app`.</w:t>
+        <w:t>El Worker `pidemelo-app` ya está creado en workers.dev y conectado a `gontzi/pidemelo`, rama `master`; las compilaciones de Workers siguen pausadas. Faltan las variables públicas del build y la reautenticación de GitHub para administrar la instalación; la validación de Actions también está bloqueada por el aviso de facturación. Ahora mismo su URL workers.dev muestra el Worker de bienvenida. Pages continúa sirviendo `pidemelo.app`.</w:t>
       </w:r>
     </w:p>
     <w:p>

</xml_diff>